<commit_message>
UNIT 3: Functions, Arrays and String Manipulation in PHP
</commit_message>
<xml_diff>
--- a/CS 3305 - Web Programming 2/week 2/assignments/Written Assignment Unit 1.docx
+++ b/CS 3305 - Web Programming 2/week 2/assignments/Written Assignment Unit 1.docx
@@ -1001,23 +1001,7 @@
           <w:sz w:val="24"/>
           <w:szCs w:val="24"/>
         </w:rPr>
-        <w:t xml:space="preserve">The script begins by collecting three exam scores through standard input, utilizing PHP’s fgets(STDIN) function for user interaction </w:t>
-      </w:r>
-      <w:r>
-        <w:rPr>
-          <w:rFonts w:ascii="Times New Roman" w:hAnsi="Times New Roman"/>
-          <w:sz w:val="24"/>
-          <w:szCs w:val="24"/>
-        </w:rPr>
-        <w:t>(McGrath, 2021)</w:t>
-      </w:r>
-      <w:r>
-        <w:rPr>
-          <w:rFonts w:ascii="Times New Roman" w:hAnsi="Times New Roman"/>
-          <w:sz w:val="24"/>
-          <w:szCs w:val="24"/>
-        </w:rPr>
-        <w:t>. The average score calculation employs the formula ($score1 + $score2 + $score3) / 3, demonstrating basic arithmetic operations with proper rounding for readability. The percentage calculation extends this logic by dividing the total score by 300 (the maximum possible points) and multiplying by 100, providing students with a clear performance metric.</w:t>
+        <w:t>The script begins by collecting three exam scores through standard input, utilizing PHP’s fgets(STDIN) function for user interaction (McGrath, 2021). The average score calculation employs the formula ($score1 + $score2 + $score3) / 3, demonstrating basic arithmetic operations with proper rounding for readability. The percentage calculation extends this logic by dividing the total score by 300 (the maximum possible points) and multiplying by 100, providing students with a clear performance metric.</w:t>
       </w:r>
     </w:p>
     <w:p>
@@ -1339,23 +1323,7 @@
           <w:sz w:val="24"/>
           <w:szCs w:val="24"/>
         </w:rPr>
-        <w:t xml:space="preserve">For five-subject evaluation, the system employs an array-based approach to store subject scores </w:t>
-      </w:r>
-      <w:r>
-        <w:rPr>
-          <w:rFonts w:ascii="Times New Roman" w:hAnsi="Times New Roman"/>
-          <w:sz w:val="24"/>
-          <w:szCs w:val="24"/>
-        </w:rPr>
-        <w:t>using PHP’s array() method (McGrath, 2021)</w:t>
-      </w:r>
-      <w:r>
-        <w:rPr>
-          <w:rFonts w:ascii="Times New Roman" w:hAnsi="Times New Roman"/>
-          <w:sz w:val="24"/>
-          <w:szCs w:val="24"/>
-        </w:rPr>
-        <w:t>. The failure counting mechanism iterates through the $scoreList array, incrementing a counter when scores fall below 50. This implementation efficiently tracks academic standing and triggers appropriate warnings when students exceed two failed subjects, as evidenced by the conditional statement if ($total &gt; 2) that displays the academic probation message.</w:t>
+        <w:t>For five-subject evaluation, the system employs an array-based approach to store subject scores using PHP’s array() method (McGrath, 2021). The failure counting mechanism iterates through the $scoreList array, incrementing a counter when scores fall below 50. This implementation efficiently tracks academic standing and triggers appropriate warnings when students exceed two failed subjects, as evidenced by the conditional statement if ($total &gt; 2) that displays the academic probation message.</w:t>
       </w:r>
     </w:p>
     <w:p>
@@ -1731,91 +1699,79 @@
           <w:sz w:val="24"/>
           <w:szCs w:val="24"/>
         </w:rPr>
-        <w:t xml:space="preserve">The conditional logic implementation demonstrates sophisticated decision-making capabilities. The pass/fail determination uses a ternary operator ($averageScore &gt;= 50) ? "Pass" : "Fail" for concise evaluation. The Honor Roll qualification combines multiple conditions using logical AND operators </w:t>
-      </w:r>
-      <w:r>
-        <w:rPr>
-          <w:rFonts w:ascii="Times New Roman" w:hAnsi="Times New Roman"/>
-          <w:sz w:val="24"/>
-          <w:szCs w:val="24"/>
-        </w:rPr>
-        <w:t>(McGrath, 2021)</w:t>
-      </w:r>
-      <w:r>
-        <w:rPr>
-          <w:rFonts w:ascii="Times New Roman" w:hAnsi="Times New Roman"/>
-          <w:sz w:val="24"/>
-          <w:szCs w:val="24"/>
-        </w:rPr>
-        <w:t>, requiring both an average above 90 and at least one score of 95 or higher.</w:t>
-      </w:r>
-    </w:p>
-    <w:p>
-      <w:pPr>
-        <w:pStyle w:val="BodyText"/>
-        <w:spacing w:lineRule="auto" w:line="480"/>
-        <w:rPr>
-          <w:rFonts w:ascii="Times New Roman" w:hAnsi="Times New Roman"/>
-          <w:sz w:val="24"/>
-          <w:szCs w:val="24"/>
-        </w:rPr>
-      </w:pPr>
-      <w:r>
-        <w:rPr>
-          <w:rFonts w:ascii="Times New Roman" w:hAnsi="Times New Roman"/>
-          <w:sz w:val="24"/>
-          <w:szCs w:val="24"/>
-        </w:rPr>
-      </w:r>
-    </w:p>
-    <w:p>
-      <w:pPr>
-        <w:pStyle w:val="BodyText"/>
-        <w:spacing w:lineRule="auto" w:line="480"/>
-        <w:rPr>
-          <w:rFonts w:ascii="Times New Roman" w:hAnsi="Times New Roman"/>
-          <w:sz w:val="24"/>
-          <w:szCs w:val="24"/>
-        </w:rPr>
-      </w:pPr>
-      <w:r>
-        <w:rPr>
-          <w:rFonts w:ascii="Times New Roman" w:hAnsi="Times New Roman"/>
-          <w:sz w:val="24"/>
-          <w:szCs w:val="24"/>
-        </w:rPr>
-      </w:r>
-    </w:p>
-    <w:p>
-      <w:pPr>
-        <w:pStyle w:val="BodyText"/>
-        <w:spacing w:lineRule="auto" w:line="480"/>
-        <w:rPr>
-          <w:rFonts w:ascii="Times New Roman" w:hAnsi="Times New Roman"/>
-          <w:sz w:val="24"/>
-          <w:szCs w:val="24"/>
-        </w:rPr>
-      </w:pPr>
-      <w:r>
-        <w:rPr>
-          <w:rFonts w:ascii="Times New Roman" w:hAnsi="Times New Roman"/>
-          <w:sz w:val="24"/>
-          <w:szCs w:val="24"/>
-        </w:rPr>
-      </w:r>
-    </w:p>
-    <w:p>
-      <w:pPr>
-        <w:pStyle w:val="BodyText"/>
-        <w:spacing w:lineRule="auto" w:line="480"/>
-        <w:rPr>
-          <w:rFonts w:ascii="Times New Roman" w:hAnsi="Times New Roman"/>
-          <w:sz w:val="24"/>
-          <w:szCs w:val="24"/>
-        </w:rPr>
-      </w:pPr>
-      <w:r>
-        <w:rPr/>
+        <w:t>The conditional logic implementation demonstrates sophisticated decision-making capabilities. The pass/fail determination uses a ternary operator ($averageScore &gt;= 50) ? "Pass" : "Fail" for concise evaluation. The Honor Roll qualification combines multiple conditions using logical AND operators (McGrath, 2021), requiring both an average above 90 and at least one score of 95 or higher.</w:t>
+      </w:r>
+    </w:p>
+    <w:p>
+      <w:pPr>
+        <w:pStyle w:val="BodyText"/>
+        <w:spacing w:lineRule="auto" w:line="480"/>
+        <w:rPr>
+          <w:rFonts w:ascii="Times New Roman" w:hAnsi="Times New Roman"/>
+          <w:sz w:val="24"/>
+          <w:szCs w:val="24"/>
+        </w:rPr>
+      </w:pPr>
+      <w:r>
+        <w:rPr>
+          <w:rFonts w:ascii="Times New Roman" w:hAnsi="Times New Roman"/>
+          <w:sz w:val="24"/>
+          <w:szCs w:val="24"/>
+        </w:rPr>
+      </w:r>
+    </w:p>
+    <w:p>
+      <w:pPr>
+        <w:pStyle w:val="BodyText"/>
+        <w:spacing w:lineRule="auto" w:line="480"/>
+        <w:rPr>
+          <w:rFonts w:ascii="Times New Roman" w:hAnsi="Times New Roman"/>
+          <w:sz w:val="24"/>
+          <w:szCs w:val="24"/>
+        </w:rPr>
+      </w:pPr>
+      <w:r>
+        <w:rPr>
+          <w:rFonts w:ascii="Times New Roman" w:hAnsi="Times New Roman"/>
+          <w:sz w:val="24"/>
+          <w:szCs w:val="24"/>
+        </w:rPr>
+      </w:r>
+    </w:p>
+    <w:p>
+      <w:pPr>
+        <w:pStyle w:val="BodyText"/>
+        <w:spacing w:lineRule="auto" w:line="480"/>
+        <w:rPr>
+          <w:rFonts w:ascii="Times New Roman" w:hAnsi="Times New Roman"/>
+          <w:sz w:val="24"/>
+          <w:szCs w:val="24"/>
+        </w:rPr>
+      </w:pPr>
+      <w:r>
+        <w:rPr>
+          <w:rFonts w:ascii="Times New Roman" w:hAnsi="Times New Roman"/>
+          <w:sz w:val="24"/>
+          <w:szCs w:val="24"/>
+        </w:rPr>
+      </w:r>
+    </w:p>
+    <w:p>
+      <w:pPr>
+        <w:pStyle w:val="BodyText"/>
+        <w:spacing w:lineRule="auto" w:line="480"/>
+        <w:rPr>
+          <w:rFonts w:ascii="Times New Roman" w:hAnsi="Times New Roman"/>
+          <w:sz w:val="24"/>
+          <w:szCs w:val="24"/>
+        </w:rPr>
+      </w:pPr>
+      <w:r>
+        <w:rPr>
+          <w:rFonts w:ascii="Times New Roman" w:hAnsi="Times New Roman"/>
+          <w:sz w:val="24"/>
+          <w:szCs w:val="24"/>
+        </w:rPr>
       </w:r>
     </w:p>
     <w:p>
@@ -1931,47 +1887,7 @@
           <w:sz w:val="24"/>
           <w:szCs w:val="24"/>
         </w:rPr>
-        <w:t xml:space="preserve">The grade assignment system utilizes </w:t>
-      </w:r>
-      <w:r>
-        <w:rPr>
-          <w:rFonts w:ascii="Times New Roman" w:hAnsi="Times New Roman"/>
-          <w:b w:val="false"/>
-          <w:bCs w:val="false"/>
-          <w:sz w:val="24"/>
-          <w:szCs w:val="24"/>
-        </w:rPr>
-        <w:t xml:space="preserve">PHP’s </w:t>
-      </w:r>
-      <w:r>
-        <w:rPr>
-          <w:rFonts w:ascii="Times New Roman" w:hAnsi="Times New Roman"/>
-          <w:b w:val="false"/>
-          <w:bCs w:val="false"/>
-          <w:sz w:val="24"/>
-          <w:szCs w:val="24"/>
-        </w:rPr>
-        <w:t xml:space="preserve">a comprehensive switch statement with case comparisons </w:t>
-      </w:r>
-      <w:r>
-        <w:rPr>
-          <w:rFonts w:ascii="Times New Roman" w:hAnsi="Times New Roman"/>
-          <w:b w:val="false"/>
-          <w:bCs w:val="false"/>
-          <w:sz w:val="24"/>
-          <w:szCs w:val="24"/>
-        </w:rPr>
-        <w:t>(McGrath, 2021)</w:t>
-      </w:r>
-      <w:r>
-        <w:rPr>
-          <w:rFonts w:ascii="Times New Roman" w:hAnsi="Times New Roman"/>
-          <w:b w:val="false"/>
-          <w:bCs w:val="false"/>
-          <w:sz w:val="24"/>
-          <w:szCs w:val="24"/>
-        </w:rPr>
-        <w:t>, mapping numerical scores to letter grades from A+ to W. This approach provides granular feedback while maintaining code readability. The validation mechanisms ensure data integrity by checking for empty inputs, numeric names, and score ranges between 0 and 100.</w:t>
+        <w:t>The grade assignment system utilizes PHP’s a comprehensive switch statement with case comparisons (McGrath, 2021), mapping numerical scores to letter grades from A+ to W. This approach provides granular feedback while maintaining code readability. The validation mechanisms ensure data integrity by checking for empty inputs, numeric names, and score ranges between 0 and 100.</w:t>
       </w:r>
     </w:p>
     <w:p>
@@ -2014,39 +1930,7 @@
           <w:sz w:val="24"/>
           <w:szCs w:val="24"/>
         </w:rPr>
-        <w:t xml:space="preserve">The </w:t>
-      </w:r>
-      <w:r>
-        <w:rPr>
-          <w:rFonts w:ascii="Times New Roman" w:hAnsi="Times New Roman"/>
-          <w:sz w:val="24"/>
-          <w:szCs w:val="24"/>
-        </w:rPr>
-        <w:t>grading system</w:t>
-      </w:r>
-      <w:r>
-        <w:rPr>
-          <w:rFonts w:ascii="Times New Roman" w:hAnsi="Times New Roman"/>
-          <w:sz w:val="24"/>
-          <w:szCs w:val="24"/>
-        </w:rPr>
-        <w:t xml:space="preserve"> features </w:t>
-      </w:r>
-      <w:r>
-        <w:rPr>
-          <w:rFonts w:ascii="Times New Roman" w:hAnsi="Times New Roman"/>
-          <w:sz w:val="24"/>
-          <w:szCs w:val="24"/>
-        </w:rPr>
-        <w:t xml:space="preserve">PHP’s </w:t>
-      </w:r>
-      <w:r>
-        <w:rPr>
-          <w:rFonts w:ascii="Times New Roman" w:hAnsi="Times New Roman"/>
-          <w:sz w:val="24"/>
-          <w:szCs w:val="24"/>
-        </w:rPr>
-        <w:t xml:space="preserve">nested while loops </w:t>
+        <w:t xml:space="preserve">The grading system features PHP’s nested while loops </w:t>
       </w:r>
       <w:r>
         <w:rPr>
@@ -2738,23 +2622,7 @@
           <w:sz w:val="24"/>
           <w:szCs w:val="24"/>
         </w:rPr>
-        <w:t xml:space="preserve">This School Grading System successfully integrates arithmetic operations, conditional logic, and loop structures to create a comprehensive academic evaluation tool. The </w:t>
-      </w:r>
-      <w:r>
-        <w:rPr>
-          <w:rFonts w:ascii="Times New Roman" w:hAnsi="Times New Roman"/>
-          <w:sz w:val="24"/>
-          <w:szCs w:val="24"/>
-        </w:rPr>
-        <w:t xml:space="preserve">system </w:t>
-      </w:r>
-      <w:r>
-        <w:rPr>
-          <w:rFonts w:ascii="Times New Roman" w:hAnsi="Times New Roman"/>
-          <w:sz w:val="24"/>
-          <w:szCs w:val="24"/>
-        </w:rPr>
-        <w:t>demonstrates proper variable naming conventions, modular code organization, and user-friendly interface design. The system effectively addresses the school's requirements while providing extensible architecture for future enhancements, making it a practical solution for automated grade processing and academic status determination.</w:t>
+        <w:t>This School Grading System successfully integrates arithmetic operations, conditional logic, and loop structures to create a comprehensive academic evaluation tool. The system demonstrates proper variable naming conventions, modular code organization, and user-friendly interface design. The system effectively addresses the school's requirements while providing extensible architecture for future enhancements, making it a practical solution for automated grade processing and academic status determination.</w:t>
       </w:r>
     </w:p>
     <w:p>
@@ -3489,8 +3357,8 @@
       <w:szCs w:val="28"/>
     </w:rPr>
   </w:style>
-  <w:style w:type="character" w:styleId="Bulletsuser">
-    <w:name w:val="Bullets (user)"/>
+  <w:style w:type="character" w:styleId="Bullets">
+    <w:name w:val="Bullets"/>
     <w:qFormat/>
     <w:rPr>
       <w:rFonts w:ascii="OpenSymbol" w:hAnsi="OpenSymbol" w:eastAsia="OpenSymbol" w:cs="OpenSymbol"/>
@@ -3511,8 +3379,8 @@
       <w:bCs/>
     </w:rPr>
   </w:style>
-  <w:style w:type="character" w:styleId="Bullets">
-    <w:name w:val="Bullets"/>
+  <w:style w:type="character" w:styleId="Bulletsuser">
+    <w:name w:val="Bullets (user)"/>
     <w:qFormat/>
     <w:rPr>
       <w:rFonts w:ascii="OpenSymbol" w:hAnsi="OpenSymbol" w:eastAsia="OpenSymbol" w:cs="OpenSymbol"/>
@@ -3659,8 +3527,8 @@
       <w:lang w:val="en-US" w:eastAsia="en-US" w:bidi="ar-SA"/>
     </w:rPr>
   </w:style>
-  <w:style w:type="paragraph" w:styleId="FrameContents">
-    <w:name w:val="Frame Contents"/>
+  <w:style w:type="paragraph" w:styleId="FrameContentsuser">
+    <w:name w:val="Frame Contents (user)"/>
     <w:basedOn w:val="Normal"/>
     <w:qFormat/>
     <w:pPr/>

</xml_diff>